<commit_message>
feat: implement interactive presentation module and add Supabase service role configuration
</commit_message>
<xml_diff>
--- a/cyber_shield_detective_rubric.docx
+++ b/cyber_shield_detective_rubric.docx
@@ -4792,6 +4792,169 @@
         <w:t>คัดลอกโจทย์คดีมาวางซ้ำโดยไม่วิเคราะห์</w:t>
       </w:r>
     </w:p>
+    <w:p>
+      <w:r>
+        <w:br w:type="page"/>
+      </w:r>
+    </w:p>
+    <w:p>
+      <w:r>
+        <w:rPr>
+          <w:rFonts w:ascii="TH Sarabun New" w:hAnsi="TH Sarabun New"/>
+          <w:b/>
+          <w:color w:val="4338CA"/>
+          <w:sz w:val="36"/>
+        </w:rPr>
+        <w:t>7. Teacher Override &amp; AI Retrain Policy</w:t>
+      </w:r>
+    </w:p>
+    <w:p>
+      <w:r>
+        <w:rPr>
+          <w:rFonts w:ascii="TH Sarabun New" w:hAnsi="TH Sarabun New"/>
+          <w:b w:val="0"/>
+          <w:sz w:val="28"/>
+        </w:rPr>
+        <w:t>ระบบให้คะแนนของ cyber_shield_detective ใช้หลายชั้นร่วมกัน เพื่อให้ AI ตรวจคำตอบได้แม่นขึ้นและครูตรวจสอบย้อนกลับได้</w:t>
+      </w:r>
+    </w:p>
+    <w:p>
+      <w:pPr>
+        <w:pStyle w:val="ListNumber"/>
+      </w:pPr>
+      <w:r>
+        <w:rPr>
+          <w:rFonts w:ascii="TH Sarabun New" w:hAnsi="TH Sarabun New"/>
+          <w:b w:val="0"/>
+          <w:sz w:val="28"/>
+        </w:rPr>
+        <w:t>Gemini AI evaluator ตรวจคำตอบตามคดี บทบาท และ rubric</w:t>
+      </w:r>
+    </w:p>
+    <w:p>
+      <w:pPr>
+        <w:pStyle w:val="ListNumber"/>
+      </w:pPr>
+      <w:r>
+        <w:rPr>
+          <w:rFonts w:ascii="TH Sarabun New" w:hAnsi="TH Sarabun New"/>
+          <w:b w:val="0"/>
+          <w:sz w:val="28"/>
+        </w:rPr>
+        <w:t>Local rubric guardrails ใน server.js ตรวจคำตอบมั่ว คำตอบผิดบทบาท คำตอบผิดคดี และรักษาระดับคะแนน 0 / 5 / 8 / 10</w:t>
+      </w:r>
+    </w:p>
+    <w:p>
+      <w:pPr>
+        <w:pStyle w:val="ListNumber"/>
+      </w:pPr>
+      <w:r>
+        <w:rPr>
+          <w:rFonts w:ascii="TH Sarabun New" w:hAnsi="TH Sarabun New"/>
+          <w:b w:val="0"/>
+          <w:sz w:val="28"/>
+        </w:rPr>
+        <w:t>Retrained student-answer memory ใน scratch/retrain_supabase_scores.js ใช้คำตอบจริงจาก Supabase เพื่อรู้จักคำตอบสั้น ภาษาพูด คำสะกดผิด และคำตอบใกล้เคียงที่ควรได้คะแนน</w:t>
+      </w:r>
+    </w:p>
+    <w:p>
+      <w:pPr>
+        <w:pStyle w:val="ListNumber"/>
+      </w:pPr>
+      <w:r>
+        <w:rPr>
+          <w:rFonts w:ascii="TH Sarabun New" w:hAnsi="TH Sarabun New"/>
+          <w:b w:val="0"/>
+          <w:sz w:val="28"/>
+        </w:rPr>
+        <w:t>Teacher override ใน cyber_shield_teacher ให้ครูแก้คะแนน Legal / Remedy / Security และเขียนคอมเมนต์ได้เป็นรายคดี</w:t>
+      </w:r>
+    </w:p>
+    <w:p>
+      <w:r>
+        <w:rPr>
+          <w:rFonts w:ascii="TH Sarabun New" w:hAnsi="TH Sarabun New"/>
+          <w:b/>
+          <w:sz w:val="32"/>
+        </w:rPr>
+        <w:t>หลักการตัดสิน</w:t>
+      </w:r>
+    </w:p>
+    <w:p>
+      <w:pPr>
+        <w:pStyle w:val="ListBullet"/>
+      </w:pPr>
+      <w:r>
+        <w:rPr>
+          <w:rFonts w:ascii="TH Sarabun New" w:hAnsi="TH Sarabun New"/>
+          <w:b w:val="0"/>
+          <w:sz w:val="28"/>
+        </w:rPr>
+        <w:t>ถ้าคำตอบถูกคดี ถูกบทบาท และแก้ปัญหาตรงจุด ให้พิจารณา 8-10 แม้ภาษาจะไม่เหมือนตัวอย่าง</w:t>
+      </w:r>
+    </w:p>
+    <w:p>
+      <w:pPr>
+        <w:pStyle w:val="ListBullet"/>
+      </w:pPr>
+      <w:r>
+        <w:rPr>
+          <w:rFonts w:ascii="TH Sarabun New" w:hAnsi="TH Sarabun New"/>
+          <w:b w:val="0"/>
+          <w:sz w:val="28"/>
+        </w:rPr>
+        <w:t>ถ้าคำตอบถูกแนวกว้าง ๆ แต่ยังไม่ครบขั้นตอน ให้พิจารณา 5</w:t>
+      </w:r>
+    </w:p>
+    <w:p>
+      <w:pPr>
+        <w:pStyle w:val="ListBullet"/>
+      </w:pPr>
+      <w:r>
+        <w:rPr>
+          <w:rFonts w:ascii="TH Sarabun New" w:hAnsi="TH Sarabun New"/>
+          <w:b w:val="0"/>
+          <w:sz w:val="28"/>
+        </w:rPr>
+        <w:t>ถ้าคำตอบผิดคดี ผิดบทบาท มั่ว ว่างเปล่า หรือเป็นคำตอบอันตราย ให้ 0</w:t>
+      </w:r>
+    </w:p>
+    <w:p>
+      <w:pPr>
+        <w:pStyle w:val="ListBullet"/>
+      </w:pPr>
+      <w:r>
+        <w:rPr>
+          <w:rFonts w:ascii="TH Sarabun New" w:hAnsi="TH Sarabun New"/>
+          <w:b w:val="0"/>
+          <w:sz w:val="28"/>
+        </w:rPr>
+        <w:t>ถ้า AI ให้คะแนนผิด ครูสามารถ override ได้ และคะแนนครูถือเป็นคะแนนสุดท้าย</w:t>
+      </w:r>
+    </w:p>
+    <w:p>
+      <w:pPr>
+        <w:pStyle w:val="ListBullet"/>
+      </w:pPr>
+      <w:r>
+        <w:rPr>
+          <w:rFonts w:ascii="TH Sarabun New" w:hAnsi="TH Sarabun New"/>
+          <w:b w:val="0"/>
+          <w:sz w:val="28"/>
+        </w:rPr>
+        <w:t>คอมเมนต์ครูควรระบุเหตุผลสั้น ๆ เช่น ตอบถูกแนวทางแต่ขาดการแจ้งครู/ผู้ปกครอง หรือ ตอบผิดมาตราแต่แนวทางบรรเทาถูก</w:t>
+      </w:r>
+    </w:p>
+    <w:p>
+      <w:r>
+        <w:rPr>
+          <w:rFonts w:ascii="TH Sarabun New" w:hAnsi="TH Sarabun New"/>
+          <w:b/>
+          <w:sz w:val="28"/>
+        </w:rPr>
+        <w:t>ข้อมูล override จะถูกเก็บใน ai_feedback.teacher_override เพื่อใช้ตรวจสอบย้อนหลังและปรับปรุงรอบ retrain ต่อไป</w:t>
+      </w:r>
+    </w:p>
     <w:sectPr>
       <w:pgSz w:w="12240" w:h="15840"/>
       <w:pgMar w:top="1152" w:right="1152" w:bottom="1152" w:left="1152" w:header="720" w:footer="720" w:gutter="0"/>

</xml_diff>